<commit_message>
feat: component description document
</commit_message>
<xml_diff>
--- a/NAGP Cloud Computing Project.docx
+++ b/NAGP Cloud Computing Project.docx
@@ -10,14 +10,17 @@
           <w:bCs/>
           <w:sz w:val="40"/>
           <w:szCs w:val="40"/>
-        </w:rPr>
-      </w:pPr>
-      <w:r>
-        <w:rPr>
-          <w:b/>
-          <w:bCs/>
+          <w:u w:val="single"/>
+        </w:rPr>
+      </w:pPr>
+      <w:r>
+        <w:rPr>
+          <w:b/>
+          <w:bCs/>
+          <w:color w:val="4472C4" w:themeColor="accent1"/>
           <w:sz w:val="40"/>
           <w:szCs w:val="40"/>
+          <w:u w:val="single"/>
         </w:rPr>
         <w:t>NAGP Cloud Computing Project</w:t>
       </w:r>
@@ -1487,69 +1490,14 @@
     <w:p>
       <w:pPr>
         <w:rPr>
+          <w:highlight w:val="yellow"/>
+        </w:rPr>
+      </w:pPr>
+      <w:r>
+        <w:rPr>
           <w:u w:val="single"/>
         </w:rPr>
-      </w:pPr>
-      <w:r>
-        <w:rPr>
-          <w:u w:val="single"/>
-        </w:rPr>
         <w:t>Attached Policies</w:t>
-      </w:r>
-    </w:p>
-    <w:p>
-      <w:pPr>
-        <w:rPr>
-          <w:highlight w:val="yellow"/>
-        </w:rPr>
-      </w:pPr>
-      <w:r>
-        <w:rPr>
-          <w:highlight w:val="yellow"/>
-        </w:rPr>
-        <w:t>Have provided full access of EC2, RDS, S3, VPC, ASG, L</w:t>
-      </w:r>
-      <w:r>
-        <w:rPr>
-          <w:highlight w:val="yellow"/>
-        </w:rPr>
-        <w:t>ambda</w:t>
-      </w:r>
-      <w:r>
-        <w:rPr>
-          <w:highlight w:val="yellow"/>
-        </w:rPr>
-        <w:t>, C</w:t>
-      </w:r>
-      <w:r>
-        <w:rPr>
-          <w:highlight w:val="yellow"/>
-        </w:rPr>
-        <w:t>loudWatch</w:t>
-      </w:r>
-      <w:r>
-        <w:rPr>
-          <w:highlight w:val="yellow"/>
-        </w:rPr>
-        <w:t>, A</w:t>
-      </w:r>
-      <w:r>
-        <w:rPr>
-          <w:highlight w:val="yellow"/>
-        </w:rPr>
-        <w:t>lb</w:t>
-      </w:r>
-      <w:r>
-        <w:rPr>
-          <w:highlight w:val="yellow"/>
-        </w:rPr>
-        <w:t xml:space="preserve"> so nagp-user can </w:t>
-      </w:r>
-      <w:r>
-        <w:rPr>
-          <w:highlight w:val="yellow"/>
-        </w:rPr>
-        <w:t>create/edit/update these resources for this assignment</w:t>
       </w:r>
     </w:p>
     <w:p>
@@ -1564,56 +1512,28 @@
           <w:color w:val="000000" w:themeColor="text1"/>
           <w:highlight w:val="yellow"/>
         </w:rPr>
-        <w:t>IAMReadOnlyAccess</w:t>
-      </w:r>
+        <w:t>IAMReadOnlyAccess provided readOnly access for IAM so any new access should be provided by root user</w:t>
+      </w:r>
+    </w:p>
+    <w:p>
+      <w:pPr>
+        <w:rPr>
+          <w:color w:val="000000" w:themeColor="text1"/>
+        </w:rPr>
+      </w:pPr>
       <w:r>
         <w:rPr>
           <w:color w:val="000000" w:themeColor="text1"/>
           <w:highlight w:val="yellow"/>
         </w:rPr>
-        <w:t xml:space="preserve"> provided readOnly access for IAM so any new access should be provided by root user</w:t>
-      </w:r>
-    </w:p>
-    <w:p>
-      <w:pPr>
-        <w:rPr>
-          <w:color w:val="000000" w:themeColor="text1"/>
-        </w:rPr>
-      </w:pPr>
+        <w:t xml:space="preserve">SecretsCreate: </w:t>
+      </w:r>
       <w:r>
         <w:rPr>
           <w:color w:val="000000" w:themeColor="text1"/>
           <w:highlight w:val="yellow"/>
         </w:rPr>
-        <w:t>SecretsCreate</w:t>
-      </w:r>
-      <w:r>
-        <w:rPr>
-          <w:color w:val="000000" w:themeColor="text1"/>
-          <w:highlight w:val="yellow"/>
-        </w:rPr>
-        <w:t xml:space="preserve">: </w:t>
-      </w:r>
-      <w:r>
-        <w:rPr>
-          <w:color w:val="000000" w:themeColor="text1"/>
-          <w:highlight w:val="yellow"/>
-        </w:rPr>
-        <w:t xml:space="preserve">this policy is specific to </w:t>
-      </w:r>
-      <w:r>
-        <w:rPr>
-          <w:color w:val="000000" w:themeColor="text1"/>
-          <w:highlight w:val="yellow"/>
-        </w:rPr>
-        <w:t>DB_SECRETS</w:t>
-      </w:r>
-      <w:r>
-        <w:rPr>
-          <w:color w:val="000000" w:themeColor="text1"/>
-          <w:highlight w:val="yellow"/>
-        </w:rPr>
-        <w:t xml:space="preserve"> secret in secrets manger to retrieve and </w:t>
+        <w:t xml:space="preserve">this policy is specific to DB_SECRETS secret in secrets manger to retrieve and </w:t>
       </w:r>
       <w:r>
         <w:rPr>
@@ -1713,96 +1633,6 @@
               <w:rPr>
                 <w:color w:val="000000" w:themeColor="text1"/>
               </w:rPr>
-              <w:t>AmazonEC2FullAccess</w:t>
-            </w:r>
-          </w:p>
-        </w:tc>
-        <w:tc>
-          <w:tcPr>
-            <w:tcW w:w="0" w:type="auto"/>
-            <w:vAlign w:val="center"/>
-            <w:hideMark/>
-          </w:tcPr>
-          <w:p>
-            <w:pPr>
-              <w:rPr>
-                <w:color w:val="000000" w:themeColor="text1"/>
-              </w:rPr>
-            </w:pPr>
-            <w:r>
-              <w:rPr>
-                <w:color w:val="000000" w:themeColor="text1"/>
-              </w:rPr>
-              <w:t>Full access to Amazon EC2 instances</w:t>
-            </w:r>
-          </w:p>
-        </w:tc>
-      </w:tr>
-      <w:tr>
-        <w:trPr>
-          <w:tblCellSpacing w:w="15" w:type="dxa"/>
-        </w:trPr>
-        <w:tc>
-          <w:tcPr>
-            <w:tcW w:w="0" w:type="auto"/>
-            <w:vAlign w:val="center"/>
-            <w:hideMark/>
-          </w:tcPr>
-          <w:p>
-            <w:pPr>
-              <w:rPr>
-                <w:color w:val="000000" w:themeColor="text1"/>
-              </w:rPr>
-            </w:pPr>
-            <w:r>
-              <w:rPr>
-                <w:color w:val="000000" w:themeColor="text1"/>
-              </w:rPr>
-              <w:t>AmazonRDSFullAccess</w:t>
-            </w:r>
-          </w:p>
-        </w:tc>
-        <w:tc>
-          <w:tcPr>
-            <w:tcW w:w="0" w:type="auto"/>
-            <w:vAlign w:val="center"/>
-            <w:hideMark/>
-          </w:tcPr>
-          <w:p>
-            <w:pPr>
-              <w:rPr>
-                <w:color w:val="000000" w:themeColor="text1"/>
-              </w:rPr>
-            </w:pPr>
-            <w:r>
-              <w:rPr>
-                <w:color w:val="000000" w:themeColor="text1"/>
-              </w:rPr>
-              <w:t>Full access to Amazon RDS databases</w:t>
-            </w:r>
-          </w:p>
-        </w:tc>
-      </w:tr>
-      <w:tr>
-        <w:trPr>
-          <w:tblCellSpacing w:w="15" w:type="dxa"/>
-        </w:trPr>
-        <w:tc>
-          <w:tcPr>
-            <w:tcW w:w="0" w:type="auto"/>
-            <w:vAlign w:val="center"/>
-            <w:hideMark/>
-          </w:tcPr>
-          <w:p>
-            <w:pPr>
-              <w:rPr>
-                <w:color w:val="000000" w:themeColor="text1"/>
-              </w:rPr>
-            </w:pPr>
-            <w:r>
-              <w:rPr>
-                <w:color w:val="000000" w:themeColor="text1"/>
-              </w:rPr>
               <w:t>AmazonS3FullAccess</w:t>
             </w:r>
           </w:p>
@@ -1848,97 +1678,6 @@
               <w:rPr>
                 <w:color w:val="000000" w:themeColor="text1"/>
               </w:rPr>
-              <w:t>AmazonVPCFullAccess</w:t>
-            </w:r>
-          </w:p>
-        </w:tc>
-        <w:tc>
-          <w:tcPr>
-            <w:tcW w:w="0" w:type="auto"/>
-            <w:vAlign w:val="center"/>
-            <w:hideMark/>
-          </w:tcPr>
-          <w:p>
-            <w:pPr>
-              <w:rPr>
-                <w:color w:val="000000" w:themeColor="text1"/>
-              </w:rPr>
-            </w:pPr>
-            <w:r>
-              <w:rPr>
-                <w:color w:val="000000" w:themeColor="text1"/>
-              </w:rPr>
-              <w:t>Full access to VPC networking resources including subnets, route tables, gateways, and security groups.</w:t>
-            </w:r>
-          </w:p>
-        </w:tc>
-      </w:tr>
-      <w:tr>
-        <w:trPr>
-          <w:tblCellSpacing w:w="15" w:type="dxa"/>
-        </w:trPr>
-        <w:tc>
-          <w:tcPr>
-            <w:tcW w:w="0" w:type="auto"/>
-            <w:vAlign w:val="center"/>
-            <w:hideMark/>
-          </w:tcPr>
-          <w:p>
-            <w:pPr>
-              <w:rPr>
-                <w:color w:val="000000" w:themeColor="text1"/>
-              </w:rPr>
-            </w:pPr>
-            <w:r>
-              <w:rPr>
-                <w:color w:val="000000" w:themeColor="text1"/>
-              </w:rPr>
-              <w:t>AutoScalingFullAccess</w:t>
-            </w:r>
-          </w:p>
-        </w:tc>
-        <w:tc>
-          <w:tcPr>
-            <w:tcW w:w="0" w:type="auto"/>
-            <w:vAlign w:val="center"/>
-            <w:hideMark/>
-          </w:tcPr>
-          <w:p>
-            <w:pPr>
-              <w:rPr>
-                <w:color w:val="000000" w:themeColor="text1"/>
-              </w:rPr>
-            </w:pPr>
-            <w:r>
-              <w:rPr>
-                <w:color w:val="000000" w:themeColor="text1"/>
-              </w:rPr>
-              <w:t>Full access to Auto Scaling groups and scaling policies.</w:t>
-            </w:r>
-          </w:p>
-        </w:tc>
-      </w:tr>
-      <w:tr>
-        <w:trPr>
-          <w:tblCellSpacing w:w="15" w:type="dxa"/>
-        </w:trPr>
-        <w:tc>
-          <w:tcPr>
-            <w:tcW w:w="0" w:type="auto"/>
-            <w:vAlign w:val="center"/>
-            <w:hideMark/>
-          </w:tcPr>
-          <w:p>
-            <w:pPr>
-              <w:rPr>
-                <w:color w:val="000000" w:themeColor="text1"/>
-              </w:rPr>
-            </w:pPr>
-            <w:r>
-              <w:rPr>
-                <w:color w:val="000000" w:themeColor="text1"/>
-              </w:rPr>
-              <w:lastRenderedPageBreak/>
               <w:t>AWSLambda_FullAccess</w:t>
             </w:r>
           </w:p>
@@ -2119,6 +1858,7 @@
               <w:rPr>
                 <w:color w:val="000000" w:themeColor="text1"/>
               </w:rPr>
+              <w:lastRenderedPageBreak/>
               <w:t>SecretsCreate</w:t>
             </w:r>
           </w:p>
@@ -2139,43 +1879,7 @@
               <w:rPr>
                 <w:color w:val="000000" w:themeColor="text1"/>
               </w:rPr>
-              <w:t xml:space="preserve">Permission to </w:t>
-            </w:r>
-            <w:r>
-              <w:rPr>
-                <w:color w:val="000000" w:themeColor="text1"/>
-              </w:rPr>
-              <w:t xml:space="preserve">list and get only </w:t>
-            </w:r>
-            <w:r>
-              <w:rPr>
-                <w:color w:val="000000" w:themeColor="text1"/>
-              </w:rPr>
-              <w:t xml:space="preserve">DB_SECRETS </w:t>
-            </w:r>
-            <w:r>
-              <w:rPr>
-                <w:color w:val="000000" w:themeColor="text1"/>
-              </w:rPr>
-              <w:t>which is</w:t>
-            </w:r>
-            <w:r>
-              <w:rPr>
-                <w:color w:val="000000" w:themeColor="text1"/>
-              </w:rPr>
-              <w:t xml:space="preserve"> manage</w:t>
-            </w:r>
-            <w:r>
-              <w:rPr>
-                <w:color w:val="000000" w:themeColor="text1"/>
-              </w:rPr>
-              <w:t>d</w:t>
-            </w:r>
-            <w:r>
-              <w:rPr>
-                <w:color w:val="000000" w:themeColor="text1"/>
-              </w:rPr>
-              <w:t xml:space="preserve"> within AWS Secrets.</w:t>
+              <w:t>Permission to list and get only DB_SECRETS which is managed within AWS Secrets.</w:t>
             </w:r>
           </w:p>
         </w:tc>
@@ -2499,54 +2203,120 @@
           <w:bCs/>
         </w:rPr>
       </w:pPr>
-      <w:r>
-        <w:rPr>
-          <w:b/>
-          <w:bCs/>
+    </w:p>
+    <w:p>
+      <w:pPr>
+        <w:rPr>
+          <w:b/>
+          <w:bCs/>
+        </w:rPr>
+      </w:pPr>
+      <w:r>
+        <w:rPr>
+          <w:b/>
+          <w:bCs/>
+        </w:rPr>
+        <w:t>IAM Identity Provider</w:t>
+      </w:r>
+    </w:p>
+    <w:p>
+      <w:r>
+        <w:t xml:space="preserve">It allows </w:t>
+      </w:r>
+      <w:r>
+        <w:t xml:space="preserve">external resources </w:t>
+      </w:r>
+      <w:r>
+        <w:t>for authentication without a</w:t>
+      </w:r>
+      <w:r>
+        <w:t>ws credentials it provides temporary token</w:t>
+      </w:r>
+      <w:r>
+        <w:t xml:space="preserve">. We used this </w:t>
+      </w:r>
+      <w:r>
+        <w:t>in</w:t>
+      </w:r>
+      <w:r>
+        <w:t xml:space="preserve"> github </w:t>
+      </w:r>
+      <w:r>
+        <w:t>for</w:t>
+      </w:r>
+      <w:r>
+        <w:t xml:space="preserve"> authentica</w:t>
+      </w:r>
+      <w:r>
+        <w:t>tion</w:t>
+      </w:r>
+      <w:r>
+        <w:t xml:space="preserve"> and use </w:t>
+      </w:r>
+      <w:r>
+        <w:t>GitHubActionsDeployToS3</w:t>
+      </w:r>
+      <w:r>
+        <w:t xml:space="preserve"> role to deploy artificats to s3.</w:t>
+      </w:r>
+    </w:p>
+    <w:p/>
+    <w:p/>
+    <w:p>
+      <w:r>
+        <w:rPr>
+          <w:highlight w:val="yellow"/>
         </w:rPr>
         <w:lastRenderedPageBreak/>
-        <w:t>IAM Identity Provider</w:t>
-      </w:r>
-    </w:p>
-    <w:p>
-      <w:r>
-        <w:t xml:space="preserve">It allows </w:t>
-      </w:r>
-      <w:r>
-        <w:t xml:space="preserve">external resources </w:t>
-      </w:r>
-      <w:r>
-        <w:t>for authentication without a</w:t>
-      </w:r>
-      <w:r>
-        <w:t>ws credentials it provides temporary token</w:t>
-      </w:r>
-      <w:r>
-        <w:t xml:space="preserve">. We used this </w:t>
-      </w:r>
-      <w:r>
-        <w:t>in</w:t>
-      </w:r>
-      <w:r>
-        <w:t xml:space="preserve"> github </w:t>
-      </w:r>
-      <w:r>
-        <w:t>for</w:t>
-      </w:r>
-      <w:r>
-        <w:t xml:space="preserve"> authentica</w:t>
-      </w:r>
-      <w:r>
-        <w:t>tion</w:t>
-      </w:r>
-      <w:r>
-        <w:t xml:space="preserve"> and use </w:t>
-      </w:r>
-      <w:r>
-        <w:t>GitHubActionsDeployToS3</w:t>
-      </w:r>
-      <w:r>
-        <w:t xml:space="preserve"> role to deploy artificats to s3.</w:t>
+        <w:t>Github workflow using OIDC (Identity provider from IAM) for authentication and IAM role to deploy artifacts to s3</w:t>
+      </w:r>
+    </w:p>
+    <w:p>
+      <w:r>
+        <w:rPr>
+          <w:noProof/>
+        </w:rPr>
+        <w:drawing>
+          <wp:inline distT="0" distB="0" distL="0" distR="0" wp14:anchorId="2CE3A77D" wp14:editId="74C0614F">
+            <wp:extent cx="5731510" cy="4196715"/>
+            <wp:effectExtent l="0" t="0" r="2540" b="0"/>
+            <wp:docPr id="156550288" name="Picture 7"/>
+            <wp:cNvGraphicFramePr>
+              <a:graphicFrameLocks xmlns:a="http://schemas.openxmlformats.org/drawingml/2006/main" noChangeAspect="1"/>
+            </wp:cNvGraphicFramePr>
+            <a:graphic xmlns:a="http://schemas.openxmlformats.org/drawingml/2006/main">
+              <a:graphicData uri="http://schemas.openxmlformats.org/drawingml/2006/picture">
+                <pic:pic xmlns:pic="http://schemas.openxmlformats.org/drawingml/2006/picture">
+                  <pic:nvPicPr>
+                    <pic:cNvPr id="156550288" name="Picture 156550288"/>
+                    <pic:cNvPicPr/>
+                  </pic:nvPicPr>
+                  <pic:blipFill>
+                    <a:blip r:embed="rId7">
+                      <a:extLst>
+                        <a:ext uri="{28A0092B-C50C-407E-A947-70E740481C1C}">
+                          <a14:useLocalDpi xmlns:a14="http://schemas.microsoft.com/office/drawing/2010/main" val="0"/>
+                        </a:ext>
+                      </a:extLst>
+                    </a:blip>
+                    <a:stretch>
+                      <a:fillRect/>
+                    </a:stretch>
+                  </pic:blipFill>
+                  <pic:spPr>
+                    <a:xfrm>
+                      <a:off x="0" y="0"/>
+                      <a:ext cx="5731510" cy="4196715"/>
+                    </a:xfrm>
+                    <a:prstGeom prst="rect">
+                      <a:avLst/>
+                    </a:prstGeom>
+                  </pic:spPr>
+                </pic:pic>
+              </a:graphicData>
+            </a:graphic>
+          </wp:inline>
+        </w:drawing>
       </w:r>
     </w:p>
     <w:p>
@@ -2723,6 +2493,7 @@
         </w:numPr>
       </w:pPr>
       <w:r>
+        <w:lastRenderedPageBreak/>
         <w:t xml:space="preserve">all the deployment artifacts will be stored in deployments folder versions will contains all deployments versions and latest.zip will contain </w:t>
       </w:r>
       <w:r>
@@ -2821,196 +2592,426 @@
       </w:r>
       <w:r>
         <w:t xml:space="preserve"> operations in response to events, automatically managing underlying infrastructure, scaling, availability.</w:t>
+      </w:r>
+    </w:p>
+    <w:p>
+      <w:r>
+        <w:t>Used 3 lambda functions</w:t>
+      </w:r>
+    </w:p>
+    <w:p>
+      <w:pPr>
+        <w:pStyle w:val="ListParagraph"/>
+        <w:numPr>
+          <w:ilvl w:val="0"/>
+          <w:numId w:val="7"/>
+        </w:numPr>
+      </w:pPr>
+      <w:r>
+        <w:rPr>
+          <w:b/>
+          <w:bCs/>
+        </w:rPr>
+        <w:t>view-doc-metadata:</w:t>
+      </w:r>
+      <w:r>
+        <w:t xml:space="preserve"> used to view records in rds</w:t>
+      </w:r>
+      <w:r>
+        <w:t>. It used a role to fetch db secrets such as db username and password from secrets manager</w:t>
+      </w:r>
+      <w:r>
+        <w:t xml:space="preserve"> via vpc endpoint.</w:t>
+      </w:r>
+    </w:p>
+    <w:p>
+      <w:pPr>
+        <w:pStyle w:val="ListParagraph"/>
+      </w:pPr>
+    </w:p>
+    <w:p>
+      <w:pPr>
+        <w:pStyle w:val="ListParagraph"/>
+        <w:numPr>
+          <w:ilvl w:val="0"/>
+          <w:numId w:val="7"/>
+        </w:numPr>
+        <w:rPr>
+          <w:b/>
+          <w:bCs/>
+        </w:rPr>
+      </w:pPr>
+      <w:r>
+        <w:rPr>
+          <w:b/>
+          <w:bCs/>
+        </w:rPr>
+        <w:t>add-doc-metaData</w:t>
+      </w:r>
+      <w:r>
+        <w:rPr>
+          <w:b/>
+          <w:bCs/>
+        </w:rPr>
+        <w:t>:</w:t>
+      </w:r>
+      <w:r>
+        <w:rPr>
+          <w:b/>
+          <w:bCs/>
+        </w:rPr>
+        <w:t xml:space="preserve"> </w:t>
+      </w:r>
+      <w:r>
+        <w:t xml:space="preserve">used to insert </w:t>
+      </w:r>
+      <w:r>
+        <w:t xml:space="preserve">metadata in rds triggered via s3 event whenever </w:t>
+      </w:r>
+      <w:r>
+        <w:t>a document is uploaded in s3_bucket/uploads path. It also uses a role to fetch db secrets</w:t>
+      </w:r>
+      <w:r>
+        <w:t>.</w:t>
+      </w:r>
+      <w:r>
+        <w:rPr>
+          <w:b/>
+          <w:bCs/>
+        </w:rPr>
+        <w:t xml:space="preserve"> </w:t>
+      </w:r>
+    </w:p>
+    <w:p>
+      <w:pPr>
+        <w:pStyle w:val="ListParagraph"/>
+        <w:numPr>
+          <w:ilvl w:val="0"/>
+          <w:numId w:val="7"/>
+        </w:numPr>
+      </w:pPr>
+      <w:r>
+        <w:rPr>
+          <w:noProof/>
+        </w:rPr>
+        <w:drawing>
+          <wp:anchor distT="0" distB="0" distL="114300" distR="114300" simplePos="0" relativeHeight="251658240" behindDoc="1" locked="0" layoutInCell="1" allowOverlap="1" wp14:anchorId="10B62AF1" wp14:editId="42599A59">
+            <wp:simplePos x="0" y="0"/>
+            <wp:positionH relativeFrom="margin">
+              <wp:posOffset>-93980</wp:posOffset>
+            </wp:positionH>
+            <wp:positionV relativeFrom="paragraph">
+              <wp:posOffset>904875</wp:posOffset>
+            </wp:positionV>
+            <wp:extent cx="5731510" cy="2468880"/>
+            <wp:effectExtent l="0" t="0" r="2540" b="7620"/>
+            <wp:wrapThrough wrapText="bothSides">
+              <wp:wrapPolygon edited="0">
+                <wp:start x="0" y="0"/>
+                <wp:lineTo x="0" y="21500"/>
+                <wp:lineTo x="21538" y="21500"/>
+                <wp:lineTo x="21538" y="0"/>
+                <wp:lineTo x="0" y="0"/>
+              </wp:wrapPolygon>
+            </wp:wrapThrough>
+            <wp:docPr id="351046454" name="Picture 3"/>
+            <wp:cNvGraphicFramePr>
+              <a:graphicFrameLocks xmlns:a="http://schemas.openxmlformats.org/drawingml/2006/main" noChangeAspect="1"/>
+            </wp:cNvGraphicFramePr>
+            <a:graphic xmlns:a="http://schemas.openxmlformats.org/drawingml/2006/main">
+              <a:graphicData uri="http://schemas.openxmlformats.org/drawingml/2006/picture">
+                <pic:pic xmlns:pic="http://schemas.openxmlformats.org/drawingml/2006/picture">
+                  <pic:nvPicPr>
+                    <pic:cNvPr id="351046454" name="Picture 351046454"/>
+                    <pic:cNvPicPr/>
+                  </pic:nvPicPr>
+                  <pic:blipFill>
+                    <a:blip r:embed="rId8" cstate="print">
+                      <a:extLst>
+                        <a:ext uri="{28A0092B-C50C-407E-A947-70E740481C1C}">
+                          <a14:useLocalDpi xmlns:a14="http://schemas.microsoft.com/office/drawing/2010/main" val="0"/>
+                        </a:ext>
+                      </a:extLst>
+                    </a:blip>
+                    <a:stretch>
+                      <a:fillRect/>
+                    </a:stretch>
+                  </pic:blipFill>
+                  <pic:spPr>
+                    <a:xfrm>
+                      <a:off x="0" y="0"/>
+                      <a:ext cx="5731510" cy="2468880"/>
+                    </a:xfrm>
+                    <a:prstGeom prst="rect">
+                      <a:avLst/>
+                    </a:prstGeom>
+                  </pic:spPr>
+                </pic:pic>
+              </a:graphicData>
+            </a:graphic>
+          </wp:anchor>
+        </w:drawing>
+      </w:r>
+      <w:r>
+        <w:rPr>
+          <w:b/>
+          <w:bCs/>
+        </w:rPr>
+        <w:t>trigger-asg-deployment</w:t>
+      </w:r>
+      <w:r>
+        <w:rPr>
+          <w:b/>
+          <w:bCs/>
+        </w:rPr>
+        <w:t>:</w:t>
+      </w:r>
+      <w:r>
+        <w:t xml:space="preserve"> used to trigger auto refresh on auto scaling groups </w:t>
+      </w:r>
+      <w:r>
+        <w:t>whenever a latest.zi</w:t>
+      </w:r>
+      <w:r>
+        <w:t xml:space="preserve">p deployment artifact is deployed on s3_bucket/deployments path. It uses a role to </w:t>
+      </w:r>
+      <w:r>
+        <w:t>initiate https request to ASG via vpc endpoint as NAT is not present due to cost constraint</w:t>
+      </w:r>
+      <w:r>
+        <w:t>.</w:t>
+      </w:r>
+    </w:p>
+    <w:p>
+      <w:pPr>
+        <w:rPr>
+          <w:highlight w:val="yellow"/>
+        </w:rPr>
+      </w:pPr>
+    </w:p>
+    <w:p>
+      <w:r>
+        <w:rPr>
+          <w:highlight w:val="yellow"/>
+        </w:rPr>
+        <w:lastRenderedPageBreak/>
+        <w:t>View-doc-metadata lambda cloudwatch logs</w:t>
+      </w:r>
+    </w:p>
+    <w:p>
+      <w:r>
+        <w:rPr>
+          <w:noProof/>
+        </w:rPr>
+        <w:drawing>
+          <wp:inline distT="0" distB="0" distL="0" distR="0" wp14:anchorId="219B9810" wp14:editId="74E9A486">
+            <wp:extent cx="5731510" cy="2887345"/>
+            <wp:effectExtent l="0" t="0" r="2540" b="8255"/>
+            <wp:docPr id="1479716720" name="Picture 4"/>
+            <wp:cNvGraphicFramePr>
+              <a:graphicFrameLocks xmlns:a="http://schemas.openxmlformats.org/drawingml/2006/main" noChangeAspect="1"/>
+            </wp:cNvGraphicFramePr>
+            <a:graphic xmlns:a="http://schemas.openxmlformats.org/drawingml/2006/main">
+              <a:graphicData uri="http://schemas.openxmlformats.org/drawingml/2006/picture">
+                <pic:pic xmlns:pic="http://schemas.openxmlformats.org/drawingml/2006/picture">
+                  <pic:nvPicPr>
+                    <pic:cNvPr id="1479716720" name="Picture 1479716720"/>
+                    <pic:cNvPicPr/>
+                  </pic:nvPicPr>
+                  <pic:blipFill>
+                    <a:blip r:embed="rId9" cstate="print">
+                      <a:extLst>
+                        <a:ext uri="{28A0092B-C50C-407E-A947-70E740481C1C}">
+                          <a14:useLocalDpi xmlns:a14="http://schemas.microsoft.com/office/drawing/2010/main" val="0"/>
+                        </a:ext>
+                      </a:extLst>
+                    </a:blip>
+                    <a:stretch>
+                      <a:fillRect/>
+                    </a:stretch>
+                  </pic:blipFill>
+                  <pic:spPr>
+                    <a:xfrm>
+                      <a:off x="0" y="0"/>
+                      <a:ext cx="5731510" cy="2887345"/>
+                    </a:xfrm>
+                    <a:prstGeom prst="rect">
+                      <a:avLst/>
+                    </a:prstGeom>
+                  </pic:spPr>
+                </pic:pic>
+              </a:graphicData>
+            </a:graphic>
+          </wp:inline>
+        </w:drawing>
+      </w:r>
+    </w:p>
+    <w:p>
+      <w:r>
+        <w:rPr>
+          <w:highlight w:val="yellow"/>
+        </w:rPr>
+        <w:t>Trigger-asg-deployment-cloudwatch logs</w:t>
+      </w:r>
+    </w:p>
+    <w:p>
+      <w:r>
+        <w:rPr>
+          <w:noProof/>
+        </w:rPr>
+        <w:drawing>
+          <wp:inline distT="0" distB="0" distL="0" distR="0" wp14:anchorId="45EB3132" wp14:editId="7FE0FA27">
+            <wp:extent cx="5731510" cy="2281555"/>
+            <wp:effectExtent l="0" t="0" r="2540" b="4445"/>
+            <wp:docPr id="1918641413" name="Picture 5"/>
+            <wp:cNvGraphicFramePr>
+              <a:graphicFrameLocks xmlns:a="http://schemas.openxmlformats.org/drawingml/2006/main" noChangeAspect="1"/>
+            </wp:cNvGraphicFramePr>
+            <a:graphic xmlns:a="http://schemas.openxmlformats.org/drawingml/2006/main">
+              <a:graphicData uri="http://schemas.openxmlformats.org/drawingml/2006/picture">
+                <pic:pic xmlns:pic="http://schemas.openxmlformats.org/drawingml/2006/picture">
+                  <pic:nvPicPr>
+                    <pic:cNvPr id="1918641413" name="Picture 1918641413"/>
+                    <pic:cNvPicPr/>
+                  </pic:nvPicPr>
+                  <pic:blipFill>
+                    <a:blip r:embed="rId10" cstate="print">
+                      <a:extLst>
+                        <a:ext uri="{28A0092B-C50C-407E-A947-70E740481C1C}">
+                          <a14:useLocalDpi xmlns:a14="http://schemas.microsoft.com/office/drawing/2010/main" val="0"/>
+                        </a:ext>
+                      </a:extLst>
+                    </a:blip>
+                    <a:stretch>
+                      <a:fillRect/>
+                    </a:stretch>
+                  </pic:blipFill>
+                  <pic:spPr>
+                    <a:xfrm>
+                      <a:off x="0" y="0"/>
+                      <a:ext cx="5731510" cy="2281555"/>
+                    </a:xfrm>
+                    <a:prstGeom prst="rect">
+                      <a:avLst/>
+                    </a:prstGeom>
+                  </pic:spPr>
+                </pic:pic>
+              </a:graphicData>
+            </a:graphic>
+          </wp:inline>
+        </w:drawing>
+      </w:r>
+    </w:p>
+    <w:p>
+      <w:pPr>
+        <w:rPr>
+          <w:b/>
+          <w:bCs/>
+        </w:rPr>
+      </w:pPr>
+      <w:r>
+        <w:rPr>
+          <w:b/>
+          <w:bCs/>
+        </w:rPr>
+        <w:t>5. Secrets Manger</w:t>
+      </w:r>
+    </w:p>
+    <w:p>
+      <w:r>
+        <w:t>It is used to store db secrets (username and password)</w:t>
+      </w:r>
+      <w:r>
+        <w:t xml:space="preserve"> which will be accessed via vpc endpoint</w:t>
+      </w:r>
+      <w:r>
+        <w:t xml:space="preserve"> as lambda’s are in private subnet</w:t>
+      </w:r>
+      <w:r>
+        <w:t>.</w:t>
+      </w:r>
+    </w:p>
+    <w:p>
+      <w:pPr>
+        <w:rPr>
+          <w:b/>
+          <w:bCs/>
+        </w:rPr>
+      </w:pPr>
+      <w:r>
+        <w:rPr>
+          <w:b/>
+          <w:bCs/>
+        </w:rPr>
+        <w:t>6. VPC</w:t>
+      </w:r>
+    </w:p>
+    <w:p>
+      <w:r>
+        <w:t>It is a</w:t>
+      </w:r>
+      <w:r>
+        <w:t xml:space="preserve"> isolated virtual network within AWS, enabling secure communication between application components while controlling network access, routing, and connectivity.</w:t>
       </w:r>
     </w:p>
     <w:p/>
     <w:p/>
-    <w:p>
-      <w:r>
+    <w:p/>
+    <w:p>
+      <w:r>
+        <w:rPr>
+          <w:highlight w:val="yellow"/>
+        </w:rPr>
         <w:lastRenderedPageBreak/>
-        <w:t>Used 3 lambda functions</w:t>
-      </w:r>
-    </w:p>
-    <w:p>
-      <w:pPr>
-        <w:pStyle w:val="ListParagraph"/>
-        <w:numPr>
-          <w:ilvl w:val="0"/>
-          <w:numId w:val="7"/>
-        </w:numPr>
-      </w:pPr>
-      <w:r>
-        <w:rPr>
-          <w:b/>
-          <w:bCs/>
-        </w:rPr>
-        <w:t>view-doc-metadata</w:t>
-      </w:r>
-      <w:r>
-        <w:rPr>
-          <w:b/>
-          <w:bCs/>
-        </w:rPr>
-        <w:t>:</w:t>
-      </w:r>
-      <w:r>
-        <w:t xml:space="preserve"> used to view records in rds</w:t>
-      </w:r>
-      <w:r>
-        <w:t>. It used a role to fetch db secrets such as db username and password from secrets manager</w:t>
-      </w:r>
-      <w:r>
-        <w:t xml:space="preserve"> via vpc endpoint.</w:t>
-      </w:r>
-    </w:p>
-    <w:p>
-      <w:pPr>
-        <w:pStyle w:val="ListParagraph"/>
-        <w:numPr>
-          <w:ilvl w:val="0"/>
-          <w:numId w:val="7"/>
-        </w:numPr>
-        <w:rPr>
-          <w:b/>
-          <w:bCs/>
-        </w:rPr>
-      </w:pPr>
-      <w:r>
-        <w:rPr>
-          <w:b/>
-          <w:bCs/>
-        </w:rPr>
-        <w:t>add-doc-metaData</w:t>
-      </w:r>
-      <w:r>
-        <w:rPr>
-          <w:b/>
-          <w:bCs/>
-        </w:rPr>
-        <w:t>:</w:t>
-      </w:r>
-      <w:r>
-        <w:rPr>
-          <w:b/>
-          <w:bCs/>
-        </w:rPr>
-        <w:t xml:space="preserve"> </w:t>
-      </w:r>
-      <w:r>
-        <w:t xml:space="preserve">used to insert </w:t>
-      </w:r>
-      <w:r>
-        <w:t xml:space="preserve">metadata in rds triggered via s3 event whenever </w:t>
-      </w:r>
-      <w:r>
-        <w:t>a document is uploaded in s3_bucket/uploads path. It also uses a role to fetch db secrets</w:t>
-      </w:r>
-      <w:r>
-        <w:t>.</w:t>
-      </w:r>
-      <w:r>
-        <w:rPr>
-          <w:b/>
-          <w:bCs/>
-        </w:rPr>
-        <w:t xml:space="preserve"> </w:t>
-      </w:r>
-    </w:p>
-    <w:p>
-      <w:pPr>
-        <w:pStyle w:val="ListParagraph"/>
-        <w:numPr>
-          <w:ilvl w:val="0"/>
-          <w:numId w:val="7"/>
-        </w:numPr>
-      </w:pPr>
-      <w:r>
-        <w:rPr>
-          <w:b/>
-          <w:bCs/>
-        </w:rPr>
-        <w:t>trigger-asg-deployment</w:t>
-      </w:r>
-      <w:r>
-        <w:rPr>
-          <w:b/>
-          <w:bCs/>
-        </w:rPr>
-        <w:t>:</w:t>
-      </w:r>
-      <w:r>
-        <w:t xml:space="preserve"> used to trigger auto refresh on auto scaling groups </w:t>
-      </w:r>
-      <w:r>
-        <w:t>whenever a latest.zi</w:t>
-      </w:r>
-      <w:r>
-        <w:t xml:space="preserve">p deployment artifact is deployed on s3_bucket/deployments path. It uses a role to </w:t>
-      </w:r>
-      <w:r>
-        <w:t>initiate https request to ASG via vpc endpoint as NAT is not present due to cost constraint</w:t>
-      </w:r>
-      <w:r>
-        <w:t>.</w:t>
-      </w:r>
-    </w:p>
-    <w:p>
-      <w:pPr>
-        <w:rPr>
-          <w:b/>
-          <w:bCs/>
-        </w:rPr>
-      </w:pPr>
-      <w:r>
-        <w:rPr>
-          <w:b/>
-          <w:bCs/>
-        </w:rPr>
-        <w:t>5. Secrets Manger</w:t>
-      </w:r>
-    </w:p>
-    <w:p>
-      <w:r>
-        <w:t>It is used to store db secrets (username and password)</w:t>
-      </w:r>
-      <w:r>
-        <w:t xml:space="preserve"> which will be accessed via vpc endpoint</w:t>
-      </w:r>
-      <w:r>
-        <w:t xml:space="preserve"> as lambda’s are in private subnet</w:t>
-      </w:r>
-      <w:r>
-        <w:t>.</w:t>
-      </w:r>
-    </w:p>
-    <w:p>
-      <w:pPr>
-        <w:rPr>
-          <w:b/>
-          <w:bCs/>
-        </w:rPr>
-      </w:pPr>
-      <w:r>
-        <w:rPr>
-          <w:b/>
-          <w:bCs/>
-        </w:rPr>
-        <w:t xml:space="preserve">6. </w:t>
-      </w:r>
-      <w:r>
-        <w:rPr>
-          <w:b/>
-          <w:bCs/>
-        </w:rPr>
-        <w:t>VPC</w:t>
-      </w:r>
-    </w:p>
-    <w:p>
-      <w:r>
-        <w:t>It is a</w:t>
-      </w:r>
-      <w:r>
-        <w:t xml:space="preserve"> isolated virtual network within AWS, enabling secure communication between application components while controlling network access, routing, and connectivity.</w:t>
+        <w:t>VPC subnet and route-table association</w:t>
+      </w:r>
+    </w:p>
+    <w:p>
+      <w:r>
+        <w:rPr>
+          <w:noProof/>
+        </w:rPr>
+        <w:drawing>
+          <wp:inline distT="0" distB="0" distL="0" distR="0" wp14:anchorId="2483DCC7" wp14:editId="0B2E0776">
+            <wp:extent cx="5731510" cy="2745740"/>
+            <wp:effectExtent l="0" t="0" r="2540" b="0"/>
+            <wp:docPr id="1738100148" name="Picture 6"/>
+            <wp:cNvGraphicFramePr>
+              <a:graphicFrameLocks xmlns:a="http://schemas.openxmlformats.org/drawingml/2006/main" noChangeAspect="1"/>
+            </wp:cNvGraphicFramePr>
+            <a:graphic xmlns:a="http://schemas.openxmlformats.org/drawingml/2006/main">
+              <a:graphicData uri="http://schemas.openxmlformats.org/drawingml/2006/picture">
+                <pic:pic xmlns:pic="http://schemas.openxmlformats.org/drawingml/2006/picture">
+                  <pic:nvPicPr>
+                    <pic:cNvPr id="1738100148" name="Picture 1738100148"/>
+                    <pic:cNvPicPr/>
+                  </pic:nvPicPr>
+                  <pic:blipFill>
+                    <a:blip r:embed="rId11" cstate="print">
+                      <a:extLst>
+                        <a:ext uri="{28A0092B-C50C-407E-A947-70E740481C1C}">
+                          <a14:useLocalDpi xmlns:a14="http://schemas.microsoft.com/office/drawing/2010/main" val="0"/>
+                        </a:ext>
+                      </a:extLst>
+                    </a:blip>
+                    <a:stretch>
+                      <a:fillRect/>
+                    </a:stretch>
+                  </pic:blipFill>
+                  <pic:spPr>
+                    <a:xfrm>
+                      <a:off x="0" y="0"/>
+                      <a:ext cx="5731510" cy="2745740"/>
+                    </a:xfrm>
+                    <a:prstGeom prst="rect">
+                      <a:avLst/>
+                    </a:prstGeom>
+                  </pic:spPr>
+                </pic:pic>
+              </a:graphicData>
+            </a:graphic>
+          </wp:inline>
+        </w:drawing>
       </w:r>
     </w:p>
     <w:p>
@@ -3145,16 +3146,7 @@
         <w:pStyle w:val="ListParagraph"/>
       </w:pPr>
       <w:r>
-        <w:t>It c</w:t>
-      </w:r>
-      <w:r>
-        <w:t>ontrol</w:t>
-      </w:r>
-      <w:r>
-        <w:t>s</w:t>
-      </w:r>
-      <w:r>
-        <w:t xml:space="preserve"> how network traffic is directed within the Amazon VPC by defining routes between subnets, gateways, and AWS resources.</w:t>
+        <w:t>It controls how network traffic is directed within the Amazon VPC by defining routes between subnets, gateways, and AWS resources.</w:t>
       </w:r>
     </w:p>
     <w:p>
@@ -3235,21 +3227,6 @@
     <w:p>
       <w:pPr>
         <w:pStyle w:val="ListParagraph"/>
-      </w:pPr>
-    </w:p>
-    <w:p>
-      <w:pPr>
-        <w:pStyle w:val="ListParagraph"/>
-      </w:pPr>
-    </w:p>
-    <w:p>
-      <w:pPr>
-        <w:pStyle w:val="ListParagraph"/>
-      </w:pPr>
-    </w:p>
-    <w:p>
-      <w:pPr>
-        <w:pStyle w:val="ListParagraph"/>
         <w:numPr>
           <w:ilvl w:val="0"/>
           <w:numId w:val="9"/>
@@ -3290,10 +3267,7 @@
         <w:t xml:space="preserve">: </w:t>
       </w:r>
       <w:r>
-        <w:t xml:space="preserve">It </w:t>
-      </w:r>
-      <w:r>
-        <w:t>provides stateless network-level traffic filtering for subnets within a VPC, controlling inbound and outbound traffic based on defined rules.</w:t>
+        <w:t>It provides stateless network-level traffic filtering for subnets within a VPC, controlling inbound and outbound traffic based on defined rules.</w:t>
       </w:r>
     </w:p>
     <w:p>
@@ -3319,10 +3293,7 @@
         <w:t xml:space="preserve">: </w:t>
       </w:r>
       <w:r>
-        <w:t>It</w:t>
-      </w:r>
-      <w:r>
-        <w:t xml:space="preserve"> act as virtual firewalls that control inbound and outbound traffic for AWS resources such as EC2 instances, Load Balancers, RDS databases, and Lambda functions within a VPC.</w:t>
+        <w:t>It act as virtual firewalls that control inbound and outbound traffic for AWS resources such as EC2 instances, Load Balancers, RDS databases, and Lambda functions within a VPC.</w:t>
       </w:r>
     </w:p>
     <w:p>
@@ -3330,6 +3301,7 @@
         <w:pStyle w:val="ListParagraph"/>
       </w:pPr>
       <w:r>
+        <w:lastRenderedPageBreak/>
         <w:t xml:space="preserve">Used </w:t>
       </w:r>
       <w:r>
@@ -3698,17 +3670,68 @@
     </w:p>
     <w:p>
       <w:r>
+        <w:t xml:space="preserve">We are handling Instance refresh once a new deployment artifact is uploaded in s3_bucket/deployments path then </w:t>
+      </w:r>
+      <w:r>
+        <w:t>trigger-asg-deployment</w:t>
+      </w:r>
+      <w:r>
+        <w:t xml:space="preserve"> lambda get’s triggered which will use </w:t>
+      </w:r>
+      <w:r>
+        <w:t>vpc endpoint to communicate with ASG</w:t>
+      </w:r>
+      <w:r>
+        <w:t>.</w:t>
+      </w:r>
+    </w:p>
+    <w:p>
+      <w:r>
+        <w:t>after that ASG initiate new instances based on the desired capacity</w:t>
+      </w:r>
+      <w:r>
+        <w:t xml:space="preserve"> marking current deployed ec2 instances as drained.</w:t>
+      </w:r>
+    </w:p>
+    <w:p>
+      <w:r>
         <w:lastRenderedPageBreak/>
-        <w:t xml:space="preserve">We are handling Instance refresh once a new deployment artifact is uploaded in s3_bucket/deployments path then </w:t>
-      </w:r>
-      <w:r>
-        <w:t>trigger-asg-deployment</w:t>
-      </w:r>
-      <w:r>
-        <w:t xml:space="preserve"> lambda get’s triggered which will use </w:t>
-      </w:r>
-      <w:r>
-        <w:t>vpc endpoint to communicate with ASG</w:t>
+        <w:t xml:space="preserve">new instances will </w:t>
+      </w:r>
+      <w:r>
+        <w:t xml:space="preserve">use base AMI and userdata will download the latest artificats from s3 bucket unzip it </w:t>
+      </w:r>
+      <w:r>
+        <w:t>and then start the server using pm2.</w:t>
+      </w:r>
+    </w:p>
+    <w:p>
+      <w:r>
+        <w:rPr>
+          <w:b/>
+          <w:bCs/>
+        </w:rPr>
+        <w:t xml:space="preserve">9. </w:t>
+      </w:r>
+      <w:r>
+        <w:rPr>
+          <w:b/>
+          <w:bCs/>
+        </w:rPr>
+        <w:t>ALB (Application Load Balancer)</w:t>
+      </w:r>
+      <w:r>
+        <w:rPr>
+          <w:b/>
+          <w:bCs/>
+        </w:rPr>
+        <w:t xml:space="preserve">: </w:t>
+      </w:r>
+      <w:r>
+        <w:t xml:space="preserve">It </w:t>
+      </w:r>
+      <w:r>
+        <w:t>distributes incoming application traffic across multiple targets, ensuring high availability, scalability, and reliable request handling</w:t>
       </w:r>
       <w:r>
         <w:t>.</w:t>
@@ -3716,37 +3739,23 @@
     </w:p>
     <w:p>
       <w:r>
-        <w:t>after that ASG initiate new instances based on the desired capacity</w:t>
-      </w:r>
-      <w:r>
-        <w:t xml:space="preserve"> marking current deployed ec2 instances as drained.</w:t>
-      </w:r>
-    </w:p>
-    <w:p>
-      <w:r>
-        <w:t xml:space="preserve">new instances will </w:t>
-      </w:r>
-      <w:r>
-        <w:t xml:space="preserve">use base AMI and userdata will download the latest artificats from s3 bucket unzip it </w:t>
-      </w:r>
-      <w:r>
-        <w:t>and then start the server using pm2.</w:t>
-      </w:r>
-    </w:p>
-    <w:p>
-      <w:r>
-        <w:rPr>
-          <w:b/>
-          <w:bCs/>
-        </w:rPr>
-        <w:t xml:space="preserve">9. </w:t>
-      </w:r>
-      <w:r>
-        <w:rPr>
-          <w:b/>
-          <w:bCs/>
-        </w:rPr>
-        <w:t>ALB (Application Load Balancer)</w:t>
+        <w:t>nagp-alb-874942920.eu-north-1.elb.amazonaws.com</w:t>
+      </w:r>
+    </w:p>
+    <w:p>
+      <w:r>
+        <w:rPr>
+          <w:b/>
+          <w:bCs/>
+        </w:rPr>
+        <w:t xml:space="preserve">10. </w:t>
+      </w:r>
+      <w:r>
+        <w:rPr>
+          <w:b/>
+          <w:bCs/>
+        </w:rPr>
+        <w:t>CloudWatch</w:t>
       </w:r>
       <w:r>
         <w:rPr>
@@ -3759,7 +3768,35 @@
         <w:t xml:space="preserve">It </w:t>
       </w:r>
       <w:r>
-        <w:t>distributes incoming application traffic across multiple targets, ensuring high availability, scalability, and reliable request handling</w:t>
+        <w:t>provides centralized monitoring, logging, alerting, and observability for AWS resources and applications, enabling proactive detection and resolution of operational issues.</w:t>
+      </w:r>
+    </w:p>
+    <w:p>
+      <w:r>
+        <w:rPr>
+          <w:b/>
+          <w:bCs/>
+        </w:rPr>
+        <w:t xml:space="preserve">cloudWatch </w:t>
+      </w:r>
+      <w:r>
+        <w:rPr>
+          <w:b/>
+          <w:bCs/>
+        </w:rPr>
+        <w:t>dashboard</w:t>
+      </w:r>
+      <w:r>
+        <w:t xml:space="preserve"> </w:t>
+      </w:r>
+      <w:r>
+        <w:t xml:space="preserve">used </w:t>
+      </w:r>
+      <w:r>
+        <w:t xml:space="preserve">to check </w:t>
+      </w:r>
+      <w:r>
+        <w:t>health status, request and average CPU utilization for both AZs</w:t>
       </w:r>
       <w:r>
         <w:t>.</w:t>
@@ -3767,71 +3804,6 @@
     </w:p>
     <w:p>
       <w:r>
-        <w:t>nagp-alb-874942920.eu-north-1.elb.amazonaws.com</w:t>
-      </w:r>
-    </w:p>
-    <w:p>
-      <w:r>
-        <w:rPr>
-          <w:b/>
-          <w:bCs/>
-        </w:rPr>
-        <w:t xml:space="preserve">10. </w:t>
-      </w:r>
-      <w:r>
-        <w:rPr>
-          <w:b/>
-          <w:bCs/>
-        </w:rPr>
-        <w:t>CloudWatch</w:t>
-      </w:r>
-      <w:r>
-        <w:rPr>
-          <w:b/>
-          <w:bCs/>
-        </w:rPr>
-        <w:t xml:space="preserve">: </w:t>
-      </w:r>
-      <w:r>
-        <w:t xml:space="preserve">It </w:t>
-      </w:r>
-      <w:r>
-        <w:t>provides centralized monitoring, logging, alerting, and observability for AWS resources and applications, enabling proactive detection and resolution of operational issues.</w:t>
-      </w:r>
-    </w:p>
-    <w:p>
-      <w:r>
-        <w:rPr>
-          <w:b/>
-          <w:bCs/>
-        </w:rPr>
-        <w:t xml:space="preserve">cloudWatch </w:t>
-      </w:r>
-      <w:r>
-        <w:rPr>
-          <w:b/>
-          <w:bCs/>
-        </w:rPr>
-        <w:t>dashboard</w:t>
-      </w:r>
-      <w:r>
-        <w:t xml:space="preserve"> </w:t>
-      </w:r>
-      <w:r>
-        <w:t xml:space="preserve">used </w:t>
-      </w:r>
-      <w:r>
-        <w:t xml:space="preserve">to check </w:t>
-      </w:r>
-      <w:r>
-        <w:t>health status, request and average CPU utilization for both AZs</w:t>
-      </w:r>
-      <w:r>
-        <w:t>.</w:t>
-      </w:r>
-    </w:p>
-    <w:p>
-      <w:r>
         <w:rPr>
           <w:b/>
           <w:bCs/>
@@ -3852,6 +3824,54 @@
       </w:r>
       <w:r>
         <w:t>also sends email to registered email.</w:t>
+      </w:r>
+    </w:p>
+    <w:p>
+      <w:r>
+        <w:rPr>
+          <w:noProof/>
+        </w:rPr>
+        <w:drawing>
+          <wp:inline distT="0" distB="0" distL="0" distR="0" wp14:anchorId="6E55DE70" wp14:editId="526469BB">
+            <wp:extent cx="5731510" cy="4436110"/>
+            <wp:effectExtent l="0" t="0" r="2540" b="2540"/>
+            <wp:docPr id="1411489554" name="Picture 2"/>
+            <wp:cNvGraphicFramePr>
+              <a:graphicFrameLocks xmlns:a="http://schemas.openxmlformats.org/drawingml/2006/main" noChangeAspect="1"/>
+            </wp:cNvGraphicFramePr>
+            <a:graphic xmlns:a="http://schemas.openxmlformats.org/drawingml/2006/main">
+              <a:graphicData uri="http://schemas.openxmlformats.org/drawingml/2006/picture">
+                <pic:pic xmlns:pic="http://schemas.openxmlformats.org/drawingml/2006/picture">
+                  <pic:nvPicPr>
+                    <pic:cNvPr id="1411489554" name="Picture 1411489554"/>
+                    <pic:cNvPicPr/>
+                  </pic:nvPicPr>
+                  <pic:blipFill>
+                    <a:blip r:embed="rId12">
+                      <a:extLst>
+                        <a:ext uri="{28A0092B-C50C-407E-A947-70E740481C1C}">
+                          <a14:useLocalDpi xmlns:a14="http://schemas.microsoft.com/office/drawing/2010/main" val="0"/>
+                        </a:ext>
+                      </a:extLst>
+                    </a:blip>
+                    <a:stretch>
+                      <a:fillRect/>
+                    </a:stretch>
+                  </pic:blipFill>
+                  <pic:spPr>
+                    <a:xfrm>
+                      <a:off x="0" y="0"/>
+                      <a:ext cx="5731510" cy="4436110"/>
+                    </a:xfrm>
+                    <a:prstGeom prst="rect">
+                      <a:avLst/>
+                    </a:prstGeom>
+                  </pic:spPr>
+                </pic:pic>
+              </a:graphicData>
+            </a:graphic>
+          </wp:inline>
+        </w:drawing>
       </w:r>
     </w:p>
     <w:sectPr>
@@ -7230,6 +7250,7 @@
   <w:style w:type="character" w:default="1" w:styleId="DefaultParagraphFont">
     <w:name w:val="Default Paragraph Font"/>
     <w:uiPriority w:val="1"/>
+    <w:semiHidden/>
     <w:unhideWhenUsed/>
   </w:style>
   <w:style w:type="table" w:default="1" w:styleId="TableNormal">

</xml_diff>